<commit_message>
Refine manuscript prose and research documentation
</commit_message>
<xml_diff>
--- a/paper/manuscript.docx
+++ b/paper/manuscript.docx
@@ -103,7 +103,7 @@
           <w:rFonts w:ascii="Times New Roman" w:hAnsi="Times New Roman" w:cs="Times New Roman"/>
           <w:sz w:val="18"/>
         </w:rPr>
-        <w:t xml:space="preserve">Abstract—Calibration with one gesture may reduce labeling effort, but its effect on the remaining vocabulary requires separate evaluation. We examine one fixed Spatial Adaptation Layer implementation on an eight-gesture CSL-HDEMG task, using participant 1 for development and four participants for evaluation over all 80 ordered session pairs and eight calibration choices. Calibration requires three seconds of labeled activity plus 90 seconds of target-session rest. Spatial and gain adaptation achieves 96.99% accuracy on held-out trials of the calibrated gesture but 34.51% on the other gestures, versus 60.71% for frozen models. A post-hoc error decomposition finds that 36.46% of other-gesture trials receive the calibration label, versus 5.61% before adaptation. Spatial-related other-class contrasts are negative in all four participants, but exact two-sided sign-flip tests yield p = 0.125; descriptive bootstrap intervals do not establish population effects. Revision follow-ups test an identity penalty and preprocessing changes on one fixed session pair. The findings concern this small cohort and implementation, not all single-gesture algorithms. Calibration fitting and held-out calibrated-class accuracy should be reported separately from other-class transfer, alongside a frozen comparator.</w:t>
+        <w:t xml:space="preserve">Abstract—Single-gesture calibration reduces the number of labeled gestures required for adaptation, but its effect on the remaining vocabulary is uncertain. We evaluate gain correction, spatial adaptation, and classifier fine-tuning in one Spatial Adaptation Layer implementation on an eight-gesture high-density electromyography task. One participant from the CSL-HDEMG dataset provides development data; four provide evaluation data covering 80 ordered session pairs and eight calibration choices. Spatial adaptation with gain achieves 96.99% accuracy on held-out trials of the calibrated gesture and 34.51% on the other gestures, compared with 60.71% for frozen models. Errors toward the calibration label account for 36.46% of other-gesture trials, compared with 5.61% before adaptation. Spatial-related other-class contrasts are negative in all four participants, although exact two-sided sign-flip tests yield p = 0.125 and bootstrap intervals remain descriptive. Exploratory experiments on one session pair test identity regularization and preprocessing changes. Calibration requires three seconds of labeled activity and 90 seconds of target-session rest, with offline processing. Within this small cohort and fixed implementation, calibrated-gesture accuracy does not establish cross-gesture retention. Evaluation should report both outcomes separately against a frozen reference.</w:t>
       </w:r>
     </w:p>
     <w:p>
@@ -129,6 +129,7 @@
         <w:numPr>
           <w:numId w:val="0"/>
         </w:numPr>
+        <w:keepNext/>
       </w:pPr>
       <w:r>
         <w:rPr>
@@ -167,7 +168,7 @@
           <w:rFonts w:ascii="Times New Roman" w:hAnsi="Times New Roman" w:cs="Times New Roman"/>
           <w:sz w:val="20"/>
         </w:rPr>
-        <w:t xml:space="preserve">We study this distinction in one public Spatial Adaptation Layer (SAL) implementation using four evaluation participants from CSL-HDEMG. All eight classes are represented during source training; “other” means absent from target calibration, not a previously unseen class. The contribution is a component evaluation of gain, spatial adaptation, and classifier fine-tuning, with exhaustive calibration choices and implementation controls. It is not a new recognizer or a claim that all single-gesture calibration fails. Different architectures, objectives, bounds, or optimizers may behave differently.</w:t>
+        <w:t xml:space="preserve">We evaluate cross-gesture transfer in one public Spatial Adaptation Layer (SAL) implementation using four participants from CSL-HDEMG. Source training includes all eight classes; the other gestures are absent only from target calibration. By separating gain correction, spatial adaptation, and classifier fine-tuning, we assess whether improved recognition of the calibrated gesture preserves the remaining vocabulary. The evaluation covers every ordered session pair and calibration gesture, with controls for implementation and search choices. Its conclusions are specific to this cohort and implementation.</w:t>
       </w:r>
     </w:p>
     <w:p>
@@ -176,13 +177,14 @@
         <w:numPr>
           <w:numId w:val="0"/>
         </w:numPr>
+        <w:keepNext/>
       </w:pPr>
       <w:r>
         <w:rPr>
           <w:rFonts w:ascii="Times New Roman" w:hAnsi="Times New Roman" w:cs="Times New Roman"/>
           <w:sz w:val="20"/>
         </w:rPr>
-        <w:t xml:space="preserve">II. Related work and scope</w:t>
+        <w:t xml:space="preserve">II. Related work</w:t>
       </w:r>
     </w:p>
     <w:p>
@@ -198,7 +200,7 @@
           <w:rFonts w:ascii="Times New Roman" w:hAnsi="Times New Roman" w:cs="Times New Roman"/>
           <w:sz w:val="20"/>
         </w:rPr>
-        <w:t xml:space="preserve">Pereira et al. introduce SAL for biosignal arrays [1]. Their later public code already includes single-gesture calibration, gain correction, and prototype search [2]. We credit those components. Our pinned implementation and disclosed preprocessing differences do not constitute an exact reproduction of the original paper's headline experiment.</w:t>
+        <w:t xml:space="preserve">Pereira et al. introduced SAL for biosignal arrays [1]. Their public implementation includes single-gesture calibration, gain correction, and prototype search [2], which form the basis of our component evaluation. We pin the source revision and document preprocessing differences; these differences preclude an exact reproduction of the original paper's main experiment.</w:t>
       </w:r>
     </w:p>
     <w:p>
@@ -214,7 +216,7 @@
           <w:rFonts w:ascii="Times New Roman" w:hAnsi="Times New Roman" w:cs="Times New Roman"/>
           <w:sz w:val="20"/>
         </w:rPr>
-        <w:t xml:space="preserve">Prior work studies flexible subset-gesture calibration [3], single-gesture fine-tuning under electrode interference [4], unknown calibration gestures [5], and source reprojection [6]. These studies precede the general motivation and prevent a broad novelty claim for limited-class calibration. Our narrower question is cross-gesture retention under matched within-person, cross-session scoring conditions. We do not claim a matched comparison with these different pipelines.</w:t>
+        <w:t xml:space="preserve">Related approaches use flexible subsets of calibration gestures [3], single-gesture fine-tuning under electrode interference [4], unknown calibration gestures [5], and source reprojection [6]. We examine a complementary question: how adaptation to one target gesture affects recognition of the other gestures under matched within-person, cross-session scoring. These earlier methods provide context rather than directly comparable benchmarks because their datasets and evaluation protocols differ.</w:t>
       </w:r>
     </w:p>
     <w:p>
@@ -223,6 +225,7 @@
         <w:numPr>
           <w:numId w:val="0"/>
         </w:numPr>
+        <w:keepNext/>
       </w:pPr>
       <w:r>
         <w:rPr>
@@ -260,7 +263,7 @@
           <w:rFonts w:ascii="Times New Roman" w:hAnsi="Times New Roman" w:cs="Times New Roman"/>
           <w:sz w:val="20"/>
         </w:rPr>
-        <w:t xml:space="preserve">CSL-HDEMG contains five participants with five sessions [7]. Participant 1, sessions 1 and 2, supplies development data. Participants 2–5 supply the primary evaluation. Each source model is trained on one session of the evaluated person; holding participants out from development does not make this cross-user recognition.</w:t>
+        <w:t xml:space="preserve">CSL-HDEMG contains five participants recorded in five sessions [7]. Participant 1, sessions 1 and 2, provides development data; participants 2–5 provide the primary evaluation. Each source model is trained on one session of the person being evaluated. The task therefore measures within-person transfer between sessions.</w:t>
       </w:r>
     </w:p>
     <w:p>
@@ -276,7 +279,7 @@
           <w:rFonts w:ascii="Times New Roman" w:hAnsi="Times New Roman" w:cs="Times New Roman"/>
           <w:sz w:val="20"/>
         </w:rPr>
-        <w:t xml:space="preserve">The eight provider gesture IDs are 8, 9, 12, 13, 16, 21, 23, and 24. Each person contributes 20 ordered session pairs. The first actual target repetition of one gesture supplies calibration; later repetitions of all eight gestures supply scoring. Repeating all eight calibration choices gives 640 cases. The first repetitions of other target gestures are unused. No target score selected the original method, gesture, setting, or checkpoint. The revision analyses and follow-up experiments described below were added after the original outcomes were known.</w:t>
+        <w:t xml:space="preserve">The eight provider gesture IDs are 8, 9, 12, 13, 16, 21, 23, and 24. Each participant contributes 20 ordered session pairs. The first available target repetition of one gesture supplies calibration, and later repetitions of all eight gestures supply scoring. Evaluating all eight calibration choices yields 640 cases. The first repetitions of the remaining target gestures are unused. Original methods, settings, gestures, and checkpoints were selected without target scoring results. Error analyses and exploratory follow-up experiments were added after the original outcomes were known.</w:t>
       </w:r>
     </w:p>
     <w:p>
@@ -292,7 +295,7 @@
           <w:rFonts w:ascii="Times New Roman" w:hAnsi="Times New Roman" w:cs="Times New Roman"/>
           <w:sz w:val="20"/>
         </w:rPr>
-        <w:t xml:space="preserve">The evaluation uses 1,598 active and 600 rest trials. Participant 4, session 4, gestures 8 and 9 each have nine rather than ten repetitions. Outcome-blind raw-data checks identified these omissions before original training. Actual trials are retained without duplication, giving 70 scoring trials for that target session and 72 elsewhere. Whole-trial roles are assigned before frame extraction and scoring identities are matched across methods.</w:t>
+        <w:t xml:space="preserve">The evaluation uses 1,598 active and 600 rest trials. Participant 4, session 4, has nine rather than ten repetitions of gestures 8 and 9. Raw-data checks identified these omissions before training or inspection of outcomes. Retaining the available trials gives 70 scoring trials for that target session and 72 elsewhere. Trial roles are assigned before frame extraction, and scoring trials are identical across methods.</w:t>
       </w:r>
     </w:p>
     <w:p>
@@ -549,7 +552,7 @@
           <w:rFonts w:ascii="Times New Roman" w:hAnsi="Times New Roman" w:cs="Times New Roman"/>
           <w:sz w:val="20"/>
         </w:rPr>
-        <w:t xml:space="preserve">The revision error analysis partitions other-class trials into correct predictions, errors to the calibration label, and errors to another wrong label. Confusion matrices are row-normalized within each case and averaged over pairs and participants separately for each calibration gesture (Supplementary Figs. S2–S7). These are descriptive post-hoc analyses.</w:t>
+        <w:t xml:space="preserve">A post-hoc error analysis partitions other-class trials into correct predictions, errors to the calibration label, and errors to another label. Confusion matrices are row-normalized within each case, then averaged over pairs and participants separately for each calibration gesture (Supplementary Figs. S2–S7).</w:t>
       </w:r>
     </w:p>
     <w:p>
@@ -564,7 +567,7 @@
           <w:rFonts w:ascii="Times New Roman" w:hAnsi="Times New Roman" w:cs="Times New Roman"/>
           <w:sz w:val="20"/>
         </w:rPr>
-        <w:t xml:space="preserve">E. Controls and revision follow-up</w:t>
+        <w:t xml:space="preserve">E. Controls and exploratory experiments</w:t>
       </w:r>
     </w:p>
     <w:p>
@@ -596,7 +599,7 @@
           <w:rFonts w:ascii="Times New Roman" w:hAnsi="Times New Roman" w:cs="Times New Roman"/>
           <w:sz w:val="20"/>
         </w:rPr>
-        <w:t xml:space="preserve">Revision follow-ups use the same fixed pair 1→2, all four participants, and all eight calibration gestures. One safeguard adds a unit-weight mean squared identity penalty to calibration cross-entropy in both candidate selection and optimization. Each physical parameter deviation is divided by its maximum allowed deviation from identity; the seven squared terms are averaged. The weight is fixed at 1 without an outcome-based sweep. Classifier parameters and normalization state remain frozen. Separate preprocessing runs activate mean-square subtraction with provider mapping, or retain inactive subtraction and use the literal upstream mapping, including its time reversal. Each preprocessing variant retrains its source model and has its own frozen reference. These exploratory 32-case checks do not establish robustness over all session pairs or new participants.</w:t>
+        <w:t xml:space="preserve">Exploratory follow-up experiments use the same fixed pair 1→2, four participants, and eight calibration gestures. To test a safeguard, we add a unit-weight identity penalty to cross-entropy during candidate selection and optimization. Each physical parameter deviation is divided by its maximum allowed deviation from identity, and the seven squared deviations are averaged. The weight is fixed at 1 without an outcome-based sweep; classifier parameters and normalization state remain frozen. Separate preprocessing experiments activate mean-square subtraction with provider mapping, or use the literal upstream mapping, including time reversal, with subtraction inactive. Each preprocessing variant retrains the source model and uses its own frozen reference. These checks cover 32 cases per variant on previously evaluated participants.</w:t>
       </w:r>
     </w:p>
     <w:p>
@@ -605,6 +608,7 @@
         <w:numPr>
           <w:numId w:val="0"/>
         </w:numPr>
+        <w:keepNext/>
       </w:pPr>
       <w:r>
         <w:rPr>
@@ -626,7 +630,7 @@
           <w:rFonts w:ascii="Times New Roman" w:hAnsi="Times New Roman" w:cs="Times New Roman"/>
           <w:sz w:val="20"/>
         </w:rPr>
-        <w:t xml:space="preserve">A. Calibrated and other gesture outcomes</w:t>
+        <w:t xml:space="preserve">A. Accuracy on calibrated and other gestures</w:t>
       </w:r>
     </w:p>
     <w:p>
@@ -1451,7 +1455,7 @@
           <w:rFonts w:ascii="Times New Roman" w:hAnsi="Times New Roman" w:cs="Times New Roman"/>
           <w:sz w:val="20"/>
         </w:rPr>
-        <w:t xml:space="preserve">Gain increases overall accuracy by 2.09 percentage points while other-class accuracy changes by −1.37 points (descriptive interval −3.92 to +2.18). Participant 5 improves, and the sign-flip p-value is 0.625. Thus an aggregate improvement does not establish improved transfer to uncalibrated classes.</w:t>
+        <w:t xml:space="preserve">Gain increases overall accuracy by 2.09 percentage points, but other-class accuracy changes by −1.37 points (descriptive interval −3.92 to +2.18). Only participant 5 improves on the other classes (Table II); the two-sided sign-flip p-value is 0.625. The overall gain therefore reflects improved recognition of the calibrated gesture.</w:t>
       </w:r>
     </w:p>
     <w:p>
@@ -3128,7 +3132,7 @@
           <w:rFonts w:ascii="Times New Roman" w:hAnsi="Times New Roman" w:cs="Times New Roman"/>
           <w:sz w:val="16"/>
         </w:rPr>
-        <w:t xml:space="preserve">Frozen is 45.49% for the restricted pair 1→2, versus 60.71% across all pairs. These 32-case seed results must not be interpreted as full-cohort all-pair means.</w:t>
+        <w:t xml:space="preserve">Each seed is evaluated on 32 cases from session pair 1→2. The matched frozen accuracy is 45.49%, compared with 60.71% across all pairs.</w:t>
       </w:r>
     </w:p>
     <w:p>
@@ -3144,7 +3148,7 @@
           <w:rFonts w:ascii="Times New Roman" w:hAnsi="Times New Roman" w:cs="Times New Roman"/>
           <w:sz w:val="20"/>
         </w:rPr>
-        <w:t xml:space="preserve">Spatial alone exceeds its matched frozen comparator on this pair at all three seeds, whereas spatial + gain remains below it. Thus all-pair mean degradation is not failure on every pair. All seeds are retained; this check does not establish seed invariance across all pairs.</w:t>
+        <w:t xml:space="preserve">Spatial adaptation alone exceeds frozen on pair 1→2 at all three seeds, whereas spatial + gain remains below it. The all-pair decrease therefore coexists with improvements on individual pairs. All seeds are reported; seed sensitivity on other pairs remains untested.</w:t>
       </w:r>
     </w:p>
     <w:p>
@@ -3968,7 +3972,7 @@
           <w:rFonts w:ascii="Times New Roman" w:hAnsi="Times New Roman" w:cs="Times New Roman"/>
           <w:sz w:val="20"/>
         </w:rPr>
-        <w:t xml:space="preserve">Spatial + gain assigns 36.46% of other-gesture trials to the calibration label, versus 5.61% frozen. It predicts that label on every scoring trial in 6/640 cases; fine-tuning does so in 67/640. Other errors remain, so the outcome is not solely total collapse. Calibration-specific matrices are provided in the supplement. They characterize output bias but do not by themselves identify a representation-level mechanism.</w:t>
+        <w:t xml:space="preserve">Spatial + gain assigns 36.46% of other-gesture trials to the calibration label, compared with 5.61% for frozen models. It predicts that label on every scoring trial in 6/640 cases; fine-tuning does so in 67/640 cases. The remaining errors show that total label collapse accounts for only part of the observed degradation. Calibration-specific confusion matrices in the supplement describe this output bias, although they cannot determine its mechanism within the model.</w:t>
       </w:r>
     </w:p>
     <w:p xmlns:wpc="http://schemas.microsoft.com/office/word/2010/wordprocessingCanvas" xmlns:mo="http://schemas.microsoft.com/office/mac/office/2008/main" xmlns:mv="urn:schemas-microsoft-com:mac:vml" xmlns:m="http://schemas.openxmlformats.org/officeDocument/2006/math" xmlns:wpg="http://schemas.microsoft.com/office/word/2010/wordprocessingGroup" xmlns:wps="http://schemas.microsoft.com/office/word/2010/wordprocessingShape">
@@ -4024,7 +4028,7 @@
           <w:rFonts w:ascii="Times New Roman" w:hAnsi="Times New Roman" w:cs="Times New Roman"/>
           <w:sz w:val="16"/>
         </w:rPr>
-        <w:t xml:space="preserve">Fig. 2. Participant changes in other-class accuracy relative to each original spatial procedure. Each bar averages 20 pairs and eight calibration choices. A dark vertical line marks zero; a dot marks the near-zero effect at its actual location. The two panels share one scale.</w:t>
+        <w:t xml:space="preserve">Fig. 2. Change in other-class accuracy relative to the original spatial procedure for each participant, averaged over 20 session pairs and eight calibration gestures. Both panels use the same scale. The vertical line indicates zero; the dot identifies a near-zero effect at its measured value.</w:t>
       </w:r>
     </w:p>
     <w:p>
@@ -4039,7 +4043,7 @@
           <w:rFonts w:ascii="Times New Roman" w:hAnsi="Times New Roman" w:cs="Times New Roman"/>
           <w:sz w:val="20"/>
         </w:rPr>
-        <w:t xml:space="preserve">E. Safeguard and preprocessing follow-up</w:t>
+        <w:t xml:space="preserve">E. Identity regularization and preprocessing</w:t>
       </w:r>
     </w:p>
     <w:p>
@@ -4055,7 +4059,7 @@
           <w:rFonts w:ascii="Times New Roman" w:hAnsi="Times New Roman" w:cs="Times New Roman"/>
           <w:sz w:val="20"/>
         </w:rPr>
-        <w:t xml:space="preserve">Identity regularization raises spatial other-class accuracy from 50.50% to 56.30% on this pair and spatial + gain from 36.11% to 37.95% (Table VI). The latter remains below frozen at 45.49%. Its held-out calibrated-class accuracy falls from 97.57% to 88.54%, illustrating the retention/fit tradeoff. Activating baseline subtraction gives spatial + gain 36.11% versus its retrained frozen reference of 45.14%; literal upstream mapping gives 37.45% versus 43.75%. Thus the combined procedure remains below its matched frozen other-class mean in both preprocessing checks, although absolute accuracy changes. This is a restricted-pair observation, not a full-pair robustness result.</w:t>
+        <w:t xml:space="preserve">On pair 1→2, identity regularization raises spatial other-class accuracy from 50.50% to 56.30% and spatial + gain from 36.11% to 37.95% (Table VI). The combined method remains below frozen at 45.49%, while its held-out calibrated-class accuracy falls from 97.57% to 88.54%. With baseline subtraction, spatial + gain achieves 36.11% against a retrained frozen reference of 45.14%. With literal upstream mapping, the corresponding accuracies are 37.45% and 43.75%. The other-class deficit persists under both preprocessing variants on this session pair.</w:t>
       </w:r>
     </w:p>
     <w:p>
@@ -4071,7 +4075,7 @@
           <w:rFonts w:ascii="Times New Roman" w:hAnsi="Times New Roman" w:cs="Times New Roman"/>
           <w:sz w:val="16"/>
         </w:rPr>
-        <w:t xml:space="preserve">TABLE VI. Other gesture accuracy in revision follow-up</w:t>
+        <w:t xml:space="preserve">TABLE VI. Other gesture accuracy in exploratory experiments</w:t>
       </w:r>
     </w:p>
     <w:tbl>
@@ -4638,7 +4642,7 @@
           <w:rFonts w:ascii="Times New Roman" w:hAnsi="Times New Roman" w:cs="Times New Roman"/>
           <w:sz w:val="16"/>
         </w:rPr>
-        <w:t xml:space="preserve">Exploratory session-pair 1→2 checks only, with 32 calibration cases and four participant means. Frozen references are specific to each preprocessing condition; the regularized condition reuses original preprocessing. Full calibrated/other/overall outcomes and participant effects are in the supplement.</w:t>
+        <w:t xml:space="preserve">Other-class accuracy (%) on session pair 1→2, averaged equally across four participants and eight calibration choices. Frozen references are specific to each preprocessing condition; identity regularization uses the original preprocessing. The supplement reports overall and calibrated-class accuracies and participant effects.</w:t>
       </w:r>
     </w:p>
     <w:p>
@@ -4654,7 +4658,7 @@
           <w:rFonts w:ascii="Times New Roman" w:hAnsi="Times New Roman" w:cs="Times New Roman"/>
           <w:sz w:val="20"/>
         </w:rPr>
-        <w:t xml:space="preserve">Original checkpoint, data-role, gain-statistic, and raw-frame verification is documented in the supplement. New adapted checkpoints are reloaded and their frame predictions checked using a different batch size. Verification establishes computational consistency, not additional independent participants.</w:t>
+        <w:t xml:space="preserve">The supplement documents checkpoint, trial-role, gain-statistic, and raw-frame verification. Follow-up checkpoints were reloaded, and their frame predictions were reproduced with a different batch size.</w:t>
       </w:r>
     </w:p>
     <w:p>
@@ -4663,6 +4667,7 @@
         <w:numPr>
           <w:numId w:val="0"/>
         </w:numPr>
+        <w:keepNext/>
       </w:pPr>
       <w:r>
         <w:rPr>
@@ -4685,7 +4690,7 @@
           <w:rFonts w:ascii="Times New Roman" w:hAnsi="Times New Roman" w:cs="Times New Roman"/>
           <w:sz w:val="20"/>
         </w:rPr>
-        <w:t xml:space="preserve">In these four CSL-HDEMG participants and this implementation, high calibrated-gesture recall accompanies substantial attraction toward its label. The single-class objective gives a direct reason for caution: cross-entropy constrains predictions only on the supplied class and does not penalize errors on omitted classes. An unrestricted classifier can reduce that objective by favoring the calibration label broadly. A bounded spatial model need not realize that global solution, but it still lacks an explicit omitted-class retention term.</w:t>
+        <w:t xml:space="preserve">For these four participants, improved recognition of the calibrated gesture was accompanied by more frequent assignment of other gestures to its label. This behavior is consistent with the single-class objective: calibration cross-entropy rewards the supplied label without penalizing errors on omitted classes. An unrestricted classifier can reduce the objective by favoring the calibration label broadly. Bounded spatial adaptation restricts the available transformations, but likewise contains no explicit term for retaining other classes.</w:t>
       </w:r>
     </w:p>
     <w:p>
@@ -4701,7 +4706,7 @@
           <w:rFonts w:ascii="Times New Roman" w:hAnsi="Times New Roman" w:cs="Times New Roman"/>
           <w:sz w:val="20"/>
         </w:rPr>
-        <w:t xml:space="preserve">Stored search logs show computed zero minimum cross-entropy in 188/640 spatial cases and 292/640 spatial + gain cases. This is consistent with finite-precision loss saturation; exact ties alone would not prove it. Loss equality at calibration therefore cannot certify transfer. In an idealized positive-template setting, different spatial transforms W can also match one template by an admissible gain g = u/(Wv), giving g ⊙ Wv = u. Clipping and interpolation limit this illustration; it is not a general identifiability theorem or proof of the observed physiological mechanism.</w:t>
+        <w:t xml:space="preserve">Stored search logs contain computed zero minimum cross-entropy in 188/640 spatial cases and 292/640 spatial + gain cases, consistent with finite-precision loss saturation. Exact ties alone do not establish saturation, and equal calibration losses need not imply equal transfer. Gain and spatial transformations may also compensate for one another: for positive templates u and v, an admissible gain g = u/(Wv) gives g ⊙ Wv = u for a transform W. This example illustrates possible ambiguity in fitting one template. Gain clipping and interpolation restrict the equivalence, so it does not establish general non-identifiability or a physiological explanation for the observed errors.</w:t>
       </w:r>
     </w:p>
     <w:p>
@@ -4717,7 +4722,7 @@
           <w:rFonts w:ascii="Times New Roman" w:hAnsi="Times New Roman" w:cs="Times New Roman"/>
           <w:sz w:val="20"/>
         </w:rPr>
-        <w:t xml:space="preserve">The identity penalty shows that a simple constraint can improve mean transfer in this bounded follow-up, but it does not restore the combined method to frozen other-class performance. Spatial alone already exceeds frozen on this pair. The result supports testing source-preserving safeguards, not recommending this weight as a validated remedy. Future work should compare source replay and other constraints on new participants, with settings selected independently of final scoring data. The appropriate practical default is to retain the frozen comparator rather than assume calibration fitting certifies retention of the remaining vocabulary.</w:t>
+        <w:t xml:space="preserve">Identity regularization improved mean other-class accuracy in the exploratory follow-up, but the combined method remained below frozen. Spatial adaptation alone already exceeded frozen on that pair. Evaluating source replay and other retention constraints across new participants and session pairs would help determine whether this improvement generalizes. Such comparisons should select settings independently of final scoring data and retain a frozen reference.</w:t>
       </w:r>
     </w:p>
     <w:p>
@@ -4733,7 +4738,7 @@
           <w:rFonts w:ascii="Times New Roman" w:hAnsi="Times New Roman" w:cs="Times New Roman"/>
           <w:sz w:val="20"/>
         </w:rPr>
-        <w:t xml:space="preserve">The recording burden is also consequential: 90 seconds of rest exceeds the labeled gesture duration thirtyfold, and both must be available in the target session. This limits claims of rapid practical recalibration. Centered RMS and full-trial voting do not model causal streaming, feedback, fatigue, or user adaptation. Closed-loop control could behave differently and requires separate evaluation.</w:t>
+        <w:t xml:space="preserve">The protocol also requires 90 seconds of target-session rest in addition to three seconds of labeled activity. This recording burden limits the practical benefit of reducing labeled calibration data. Centered RMS and whole-trial voting support offline evaluation; they do not represent causal streaming or closed-loop control with feedback, fatigue, and user adaptation.</w:t>
       </w:r>
     </w:p>
     <w:p>
@@ -4742,6 +4747,7 @@
         <w:numPr>
           <w:numId w:val="0"/>
         </w:numPr>
+        <w:keepNext/>
       </w:pPr>
       <w:r>
         <w:rPr>
@@ -4764,7 +4770,7 @@
           <w:rFonts w:ascii="Times New Roman" w:hAnsi="Times New Roman" w:cs="Times New Roman"/>
           <w:sz w:val="20"/>
         </w:rPr>
-        <w:t xml:space="preserve">The primary evidence is limited to four evaluation participants, one dataset, eight selected gestures, one source-training seed, and one fixed implementation. Revision follow-ups reuse known participants and one session pair; they are exploratory and do not replace an independent larger-cohort, multi-session HD-EMG replication. Architecture, bounds, objectives, and optimizer changes could reduce or remove the observed degradation. Natural session variation does not isolate controlled electrode displacement.</w:t>
+        <w:t xml:space="preserve">The primary evaluation comprises four participants, one dataset, eight selected gestures, one source-training seed, and one fixed implementation. The exploratory follow-ups reuse those participants and a single session pair. Replication on a larger independent cohort and a second multi-session dataset is needed to assess generalizability. Changes to architecture, bounds, objectives, or optimization may alter the observed degradation, and natural session variation does not isolate controlled electrode displacement.</w:t>
       </w:r>
     </w:p>
     <w:p>
@@ -4780,7 +4786,7 @@
           <w:rFonts w:ascii="Times New Roman" w:hAnsi="Times New Roman" w:cs="Times New Roman"/>
           <w:sz w:val="20"/>
         </w:rPr>
-        <w:t xml:space="preserve">Within this scope, calibrated-class success does not establish preservation of the remaining vocabulary. Retain a frozen comparator and report calibration fitting, disjoint calibrated-class performance, other-class performance, and recording cost separately. The results support this reporting practice, not a universal failure claim or a new state-of-the-art recognizer.</w:t>
+        <w:t xml:space="preserve">In this evaluation, high accuracy on the calibrated gesture did not ensure retention of the remaining vocabulary. Reporting calibration fit, held-out calibrated-class accuracy, other-class accuracy, and recording cost separately makes this distinction visible. A frozen comparator remains necessary to quantify the benefit or loss associated with adaptation.</w:t>
       </w:r>
     </w:p>
     <w:p>
@@ -4789,13 +4795,14 @@
         <w:numPr>
           <w:numId w:val="0"/>
         </w:numPr>
+        <w:keepNext/>
       </w:pPr>
       <w:r>
         <w:rPr>
           <w:rFonts w:ascii="Times New Roman" w:hAnsi="Times New Roman" w:cs="Times New Roman"/>
           <w:sz w:val="20"/>
         </w:rPr>
-        <w:t xml:space="preserve">Reproducibility material</w:t>
+        <w:t xml:space="preserve">Code and data availability</w:t>
       </w:r>
     </w:p>
     <w:p>
@@ -4811,7 +4818,7 @@
           <w:rFonts w:ascii="Times New Roman" w:hAnsi="Times New Roman" w:cs="Times New Roman"/>
           <w:sz w:val="20"/>
         </w:rPr>
-        <w:t xml:space="preserve">Analysis code, numerical records, and experiment protocols are maintained at https://github.com/Lu-Charles/bibe-single-gesture-transfer. The repository is currently private. Included scripts reproduce the manuscript tables, error decompositions, calibration-specific confusion matrices, exact sign-flip tests, and exploratory follow-up summaries from saved records. Raw-data training requires the original dataset and experiment workspace; raw recordings and model checkpoints are not included in the repository.</w:t>
+        <w:t xml:space="preserve">Analysis code, numerical records, and protocols are available in the private repository https://github.com/Lu-Charles/bibe-single-gesture-transfer. The scripts reproduce the tables, error analyses, confusion matrices, sign-flip tests, and follow-up summaries from saved records. Repeating model training requires the raw dataset and original experiment workspace.</w:t>
       </w:r>
     </w:p>
     <w:p>
@@ -4827,7 +4834,7 @@
           <w:rFonts w:ascii="Times New Roman" w:hAnsi="Times New Roman" w:cs="Times New Roman"/>
           <w:sz w:val="20"/>
         </w:rPr>
-        <w:t xml:space="preserve">The original data are available through the CSL-HDEMG provider's registration process [7]. Raw recordings and checkpoint banks are excluded from the analysis distribution. This study reanalyzes existing recordings without new recruitment; no new consent or institutional ethics approval is claimed.</w:t>
+        <w:t xml:space="preserve">CSL-HDEMG recordings are available through the provider's registration process [7]. Raw recordings and model checkpoints are excluded from the repository. This secondary analysis uses existing recordings and involved no new participant recruitment.</w:t>
       </w:r>
     </w:p>
     <w:p>

</xml_diff>

<commit_message>
Correct document metadata and clarify method references
</commit_message>
<xml_diff>
--- a/paper/manuscript.docx
+++ b/paper/manuscript.docx
@@ -342,7 +342,7 @@
           <w:rFonts w:ascii="Times New Roman" w:hAnsi="Times New Roman" w:cs="Times New Roman"/>
           <w:sz w:val="20"/>
         </w:rPr>
-        <w:t xml:space="preserve">Processing uses trial-wise centering, causal 20–380 Hz band-pass and 45–55 Hz band-stop filters, activity segmentation, a 1,025-sample centered RMS window, and a zero-padded 3 × 3 spatial median filter. The original literal “mean_square” flag does not activate the upstream “mean-square” subtraction branch. Scoring data do not fit model normalization statistics. Segmentation uses 30 three-second rest trials from the target session, so three seconds of labeled activity requires 90 additional seconds of rest. Centered RMS and whole-trial voting make the experiment offline.</w:t>
+        <w:t xml:space="preserve">Processing uses trial-wise centering, causal 20–380 Hz band-pass and 45–55 Hz band-stop filters, activity segmentation, a 1,025-sample centered root-mean-square (RMS) window, and a zero-padded 3 × 3 spatial median filter. The original literal “mean_square” flag does not activate the upstream “mean-square” subtraction branch. Scoring data do not fit model normalization statistics. Segmentation uses 30 three-second rest trials from the target session, so three seconds of labeled activity requires 90 additional seconds of rest. Centered RMS and whole-trial voting make the experiment offline.</w:t>
       </w:r>
     </w:p>
     <w:p>
@@ -373,7 +373,7 @@
           <w:rFonts w:ascii="Times New Roman" w:hAnsi="Times New Roman" w:cs="Times New Roman"/>
           <w:sz w:val="20"/>
         </w:rPr>
-        <w:t xml:space="preserve">The source recognizer uses batch normalization, dropout 0.5, and a linear eight-class classifier. Source training uses 15 epochs of Adam at 0.001, batch size 128, a three-epoch warm-up, seed 42, and the final checkpoint. The upstream revision and complete settings are recorded in the reproduction package [2].</w:t>
+        <w:t xml:space="preserve">The source recognizer uses batch normalization, dropout 0.5, and a linear eight-class classifier. Source training uses 15 epochs of Adam at 0.001, batch size 128, a three-epoch warm-up, seed 42, and the final checkpoint. The pinned upstream revision is given in [2]; experiment settings are included in the analysis repository.</w:t>
       </w:r>
     </w:p>
     <w:p>
@@ -5007,28 +5007,6 @@
     </w:p>
   </w:endnote>
 </w:endnotes>
-</file>
-
-<file path=word/footer1.xml><?xml version="1.0" encoding="utf-8"?>
-<w:ftr xmlns:cx="http://schemas.microsoft.com/office/drawing/2014/chartex" xmlns:cx1="http://schemas.microsoft.com/office/drawing/2015/9/8/chartex" xmlns:cx2="http://schemas.microsoft.com/office/drawing/2015/10/21/chartex" xmlns:cx3="http://schemas.microsoft.com/office/drawing/2016/5/9/chartex" xmlns:cx4="http://schemas.microsoft.com/office/drawing/2016/5/10/chartex" xmlns:cx5="http://schemas.microsoft.com/office/drawing/2016/5/11/chartex" xmlns:cx6="http://schemas.microsoft.com/office/drawing/2016/5/12/chartex" xmlns:cx7="http://schemas.microsoft.com/office/drawing/2016/5/13/chartex" xmlns:cx8="http://schemas.microsoft.com/office/drawing/2016/5/14/chartex" xmlns:mc="http://schemas.openxmlformats.org/markup-compatibility/2006" xmlns:aink="http://schemas.microsoft.com/office/drawing/2016/ink" xmlns:am3d="http://schemas.microsoft.com/office/drawing/2017/model3d" xmlns:o="urn:schemas-microsoft-com:office:office" xmlns:oel="http://schemas.microsoft.com/office/2019/extlst" xmlns:r="http://purl.oclc.org/ooxml/officeDocument/relationships" xmlns:m="http://purl.oclc.org/ooxml/officeDocument/math" xmlns:v="urn:schemas-microsoft-com:vml" xmlns:wp14="http://schemas.microsoft.com/office/word/2010/wordprocessingDrawing" xmlns:wp="http://purl.oclc.org/ooxml/drawingml/wordprocessingDrawing" xmlns:w10="urn:schemas-microsoft-com:office:word" xmlns:w="http://purl.oclc.org/ooxml/wordprocessingml/main" xmlns:w14="http://schemas.microsoft.com/office/word/2010/wordml" xmlns:w15="http://schemas.microsoft.com/office/word/2012/wordml" xmlns:w16cex="http://schemas.microsoft.com/office/word/2018/wordml/cex" xmlns:w16cid="http://schemas.microsoft.com/office/word/2016/wordml/cid" xmlns:w16="http://schemas.microsoft.com/office/word/2018/wordml" xmlns:w16sdtdh="http://schemas.microsoft.com/office/word/2020/wordml/sdtdatahash" xmlns:w16se="http://schemas.microsoft.com/office/word/2015/wordml/symex" xmlns:wpi="http://schemas.microsoft.com/office/word/2010/wordprocessingInk" xmlns:wne="http://schemas.microsoft.com/office/word/2006/wordml" mc:Ignorable="w14 w15 w16se w16cid w16 w16cex w16sdtdh wne wp14">
-  <w:p>
-    <w:pPr>
-      <w:pStyle w:val="Footer"/>
-      <w:jc w:val="start"/>
-      <w:rPr>
-        <w:sz w:val="16"/>
-        <w:szCs w:val="16"/>
-      </w:rPr>
-    </w:pPr>
-    <w:r>
-      <w:rPr>
-        <w:sz w:val="16"/>
-        <w:szCs w:val="16"/>
-      </w:rPr>
-      <w:t>XXX-X-XXXX-XXXX-X/XX/$XX.00 ©20XX IEEE</w:t>
-    </w:r>
-  </w:p>
-</w:ftr>
 </file>
 
 <file path=word/footnotes.xml><?xml version="1.0" encoding="utf-8"?>
@@ -7537,16 +7515,4 @@
     </a:ext>
   </a:extLst>
 </a:theme>
-</file>
-
-<file path=customXml/item1.xml><?xml version="1.0" encoding="utf-8"?>
-<b:Sources xmlns:b="http://schemas.openxmlformats.org/officeDocument/2006/bibliography" xmlns="http://schemas.openxmlformats.org/officeDocument/2006/bibliography" SelectedStyle="\APA.XSL" StyleName="APA"/>
-</file>
-
-<file path=customXml/itemProps1.xml><?xml version="1.0" encoding="utf-8"?>
-<ds:datastoreItem xmlns:ds="http://purl.oclc.org/ooxml/officeDocument/customXml" ds:itemID="{174953BD-B001-433D-BAEA-84E6680CEBE7}">
-  <ds:schemaRefs>
-    <ds:schemaRef ds:uri="http://schemas.openxmlformats.org/officeDocument/2006/bibliography"/>
-  </ds:schemaRefs>
-</ds:datastoreItem>
 </file>
</xml_diff>